<commit_message>
Remove acetaminophen, biotin, and calcium chloride from JIP3 list
</commit_message>
<xml_diff>
--- a/jip3_6.docx
+++ b/jip3_6.docx
@@ -94,7 +94,7 @@
                 <w:sz w:val="20"/>
                 <w:b w:val="true"/>
               </w:rPr>
-              <w:t xml:space="preserve">acetaminophen</w:t>
+              <w:t xml:space="preserve">acetylcysteine</w:t>
             </w:r>
           </w:p>
         </w:tc>
@@ -135,7 +135,7 @@
                 <w:rFonts w:ascii="Calibri" w:hAnsi="Calibri"/>
                 <w:sz w:val="20"/>
               </w:rPr>
-              <w:t xml:space="preserve">DRD2</w:t>
+              <w:t xml:space="preserve">LRRK2</w:t>
             </w:r>
             <w:r>
               <w:rPr>
@@ -150,7 +150,7 @@
                 <w:rFonts w:ascii="Calibri" w:hAnsi="Calibri"/>
                 <w:sz w:val="20"/>
               </w:rPr>
-              <w:t xml:space="preserve">LRRK2</w:t>
+              <w:t xml:space="preserve">NTRK2</w:t>
             </w:r>
             <w:r>
               <w:rPr>
@@ -165,21 +165,6 @@
                 <w:rFonts w:ascii="Calibri" w:hAnsi="Calibri"/>
                 <w:sz w:val="20"/>
               </w:rPr>
-              <w:t xml:space="preserve">NTRK2</w:t>
-            </w:r>
-            <w:r>
-              <w:rPr>
-                <w:rFonts w:ascii="Calibri" w:hAnsi="Calibri"/>
-                <w:sz w:val="20"/>
-              </w:rPr>
-              <w:t xml:space="preserve">, </w:t>
-            </w:r>
-            <w:r>
-              <w:rPr>
-                <w:i/>
-                <w:rFonts w:ascii="Calibri" w:hAnsi="Calibri"/>
-                <w:sz w:val="20"/>
-              </w:rPr>
               <w:t xml:space="preserve">SPAG9</w:t>
             </w:r>
             <w:r>
@@ -187,7 +172,7 @@
                 <w:rFonts w:ascii="Calibri" w:hAnsi="Calibri"/>
                 <w:sz w:val="20"/>
               </w:rPr>
-              <w:t xml:space="preserve">, autism, axonal neuropathy, generalized dystonia, inborn disorder of neurotransmitter metabolism and transport, increased reactive oxygen species production, movement disorder, neurodegenerative disease, neuroinflammation, spasticity</w:t>
+              <w:t xml:space="preserve">, autism, axonal neuropathy, cerebellar ataxia, generalized dystonia, inborn disorder of neurotransmitter metabolism and transport, increased reactive oxygen species production, movement disorder, neurodegenerative disease, neurodevelopmental disorder, neuroinflammation</w:t>
             </w:r>
           </w:p>
         </w:tc>
@@ -218,7 +203,7 @@
                 <w:sz w:val="20"/>
                 <w:b w:val="true"/>
               </w:rPr>
-              <w:t xml:space="preserve">acetylcysteine</w:t>
+              <w:t xml:space="preserve">amitriptyline</w:t>
             </w:r>
           </w:p>
         </w:tc>
@@ -243,36 +228,6 @@
                 <w:rFonts w:ascii="Calibri" w:hAnsi="Calibri"/>
                 <w:sz w:val="20"/>
               </w:rPr>
-              <w:t xml:space="preserve">ARF6</w:t>
-            </w:r>
-            <w:r>
-              <w:rPr>
-                <w:rFonts w:ascii="Calibri" w:hAnsi="Calibri"/>
-                <w:sz w:val="20"/>
-              </w:rPr>
-              <w:t xml:space="preserve">, </w:t>
-            </w:r>
-            <w:r>
-              <w:rPr>
-                <w:i/>
-                <w:rFonts w:ascii="Calibri" w:hAnsi="Calibri"/>
-                <w:sz w:val="20"/>
-              </w:rPr>
-              <w:t xml:space="preserve">LRRK2</w:t>
-            </w:r>
-            <w:r>
-              <w:rPr>
-                <w:rFonts w:ascii="Calibri" w:hAnsi="Calibri"/>
-                <w:sz w:val="20"/>
-              </w:rPr>
-              <w:t xml:space="preserve">, </w:t>
-            </w:r>
-            <w:r>
-              <w:rPr>
-                <w:i/>
-                <w:rFonts w:ascii="Calibri" w:hAnsi="Calibri"/>
-                <w:sz w:val="20"/>
-              </w:rPr>
               <w:t xml:space="preserve">NTRK2</w:t>
             </w:r>
             <w:r>
@@ -280,22 +235,7 @@
                 <w:rFonts w:ascii="Calibri" w:hAnsi="Calibri"/>
                 <w:sz w:val="20"/>
               </w:rPr>
-              <w:t xml:space="preserve">, </w:t>
-            </w:r>
-            <w:r>
-              <w:rPr>
-                <w:i/>
-                <w:rFonts w:ascii="Calibri" w:hAnsi="Calibri"/>
-                <w:sz w:val="20"/>
-              </w:rPr>
-              <w:t xml:space="preserve">SPAG9</w:t>
-            </w:r>
-            <w:r>
-              <w:rPr>
-                <w:rFonts w:ascii="Calibri" w:hAnsi="Calibri"/>
-                <w:sz w:val="20"/>
-              </w:rPr>
-              <w:t xml:space="preserve">, autism, axonal neuropathy, cerebellar ataxia, generalized dystonia, inborn disorder of neurotransmitter metabolism and transport, increased reactive oxygen species production, movement disorder, neurodegenerative disease, neurodevelopmental disorder, neuroinflammation</w:t>
+              <w:t xml:space="preserve">, autism, axonal neuropathy, cerebellar ataxia, generalized dystonia, inborn disorder of neurotransmitter metabolism and transport, intellectual disability, movement disorder, neuroinflammation, spasticity</w:t>
             </w:r>
           </w:p>
         </w:tc>
@@ -326,7 +266,7 @@
                 <w:sz w:val="20"/>
                 <w:b w:val="true"/>
               </w:rPr>
-              <w:t xml:space="preserve">amitriptyline</w:t>
+              <w:t xml:space="preserve">azelaic acid</w:t>
             </w:r>
           </w:p>
         </w:tc>
@@ -352,14 +292,22 @@
                 <w:rFonts w:ascii="Calibri" w:hAnsi="Calibri"/>
                 <w:sz w:val="20"/>
               </w:rPr>
-              <w:t xml:space="preserve">NTRK2</w:t>
-            </w:r>
-            <w:r>
-              <w:rPr>
-                <w:rFonts w:ascii="Calibri" w:hAnsi="Calibri"/>
-                <w:sz w:val="20"/>
-              </w:rPr>
-              <w:t xml:space="preserve">, autism, axonal neuropathy, cerebellar ataxia, generalized dystonia, inborn disorder of neurotransmitter metabolism and transport, intellectual disability, movement disorder, neuroinflammation, spasticity</w:t>
+              <w:t xml:space="preserve">LRRK2</w:t>
+            </w:r>
+            <w:r>
+              <w:rPr>
+                <w:rFonts w:ascii="Calibri" w:hAnsi="Calibri"/>
+                <w:sz w:val="20"/>
+              </w:rPr>
+              <w:t xml:space="preserve">, </w:t>
+            </w:r>
+            <w:r>
+              <w:rPr>
+                <w:i/>
+                <w:rFonts w:ascii="Calibri" w:hAnsi="Calibri"/>
+                <w:sz w:val="20"/>
+              </w:rPr>
+              <w:t xml:space="preserve">MAPK8</w:t>
             </w:r>
           </w:p>
         </w:tc>
@@ -390,7 +338,7 @@
                 <w:sz w:val="20"/>
                 <w:b w:val="true"/>
               </w:rPr>
-              <w:t xml:space="preserve">azelaic acid</w:t>
+              <w:t xml:space="preserve">betamethasone</w:t>
             </w:r>
           </w:p>
         </w:tc>
@@ -415,7 +363,7 @@
                 <w:rFonts w:ascii="Calibri" w:hAnsi="Calibri"/>
                 <w:sz w:val="20"/>
               </w:rPr>
-              <w:t xml:space="preserve">LRRK2</w:t>
+              <w:t xml:space="preserve">ARF6</w:t>
             </w:r>
             <w:r>
               <w:rPr>
@@ -430,7 +378,14 @@
                 <w:rFonts w:ascii="Calibri" w:hAnsi="Calibri"/>
                 <w:sz w:val="20"/>
               </w:rPr>
-              <w:t xml:space="preserve">MAPK8</w:t>
+              <w:t xml:space="preserve">CDK5</w:t>
+            </w:r>
+            <w:r>
+              <w:rPr>
+                <w:rFonts w:ascii="Calibri" w:hAnsi="Calibri"/>
+                <w:sz w:val="20"/>
+              </w:rPr>
+              <w:t xml:space="preserve">, axonal neuropathy, cerebellar ataxia, inborn disorder of neurotransmitter metabolism and transport</w:t>
             </w:r>
           </w:p>
         </w:tc>
@@ -461,7 +416,7 @@
                 <w:sz w:val="20"/>
                 <w:b w:val="true"/>
               </w:rPr>
-              <w:t xml:space="preserve">betamethasone</w:t>
+              <w:t xml:space="preserve">budesonide</w:t>
             </w:r>
           </w:p>
         </w:tc>
@@ -487,7 +442,7 @@
                 <w:rFonts w:ascii="Calibri" w:hAnsi="Calibri"/>
                 <w:sz w:val="20"/>
               </w:rPr>
-              <w:t xml:space="preserve">ARF6</w:t>
+              <w:t xml:space="preserve">CDK5</w:t>
             </w:r>
             <w:r>
               <w:rPr>
@@ -502,14 +457,14 @@
                 <w:rFonts w:ascii="Calibri" w:hAnsi="Calibri"/>
                 <w:sz w:val="20"/>
               </w:rPr>
-              <w:t xml:space="preserve">CDK5</w:t>
-            </w:r>
-            <w:r>
-              <w:rPr>
-                <w:rFonts w:ascii="Calibri" w:hAnsi="Calibri"/>
-                <w:sz w:val="20"/>
-              </w:rPr>
-              <w:t xml:space="preserve">, axonal neuropathy, cerebellar ataxia, inborn disorder of neurotransmitter metabolism and transport</w:t>
+              <w:t xml:space="preserve">LRRK2</w:t>
+            </w:r>
+            <w:r>
+              <w:rPr>
+                <w:rFonts w:ascii="Calibri" w:hAnsi="Calibri"/>
+                <w:sz w:val="20"/>
+              </w:rPr>
+              <w:t xml:space="preserve">, inborn disorder of neurotransmitter metabolism and transport, neuroinflammation</w:t>
             </w:r>
           </w:p>
         </w:tc>
@@ -540,7 +495,7 @@
                 <w:sz w:val="20"/>
                 <w:b w:val="true"/>
               </w:rPr>
-              <w:t xml:space="preserve">biotin</w:t>
+              <w:t xml:space="preserve">buspirone</w:t>
             </w:r>
           </w:p>
         </w:tc>
@@ -565,14 +520,14 @@
                 <w:rFonts w:ascii="Calibri" w:hAnsi="Calibri"/>
                 <w:sz w:val="20"/>
               </w:rPr>
-              <w:t xml:space="preserve">LRRK2</w:t>
-            </w:r>
-            <w:r>
-              <w:rPr>
-                <w:rFonts w:ascii="Calibri" w:hAnsi="Calibri"/>
-                <w:sz w:val="20"/>
-              </w:rPr>
-              <w:t xml:space="preserve">, autism, axonal neuropathy, cerebellar ataxia, generalized dystonia, inborn disorder of neurotransmitter metabolism and transport, intellectual disability, movement disorder, neurodegenerative disease, neuroinflammation</w:t>
+              <w:t xml:space="preserve">DRD1</w:t>
+            </w:r>
+            <w:r>
+              <w:rPr>
+                <w:rFonts w:ascii="Calibri" w:hAnsi="Calibri"/>
+                <w:sz w:val="20"/>
+              </w:rPr>
+              <w:t xml:space="preserve">, autism, axonal neuropathy, cerebellar ataxia, generalized dystonia, inborn disorder of neurotransmitter metabolism and transport, intellectual disability, movement disorder, neurodegenerative disease, neurodevelopmental disorder, spasticity</w:t>
             </w:r>
           </w:p>
         </w:tc>
@@ -603,7 +558,7 @@
                 <w:sz w:val="20"/>
                 <w:b w:val="true"/>
               </w:rPr>
-              <w:t xml:space="preserve">budesonide</w:t>
+              <w:t xml:space="preserve">clonidine</w:t>
             </w:r>
           </w:p>
         </w:tc>
@@ -625,33 +580,10 @@
             </w:pPr>
             <w:r>
               <w:rPr>
-                <w:i/>
-                <w:rFonts w:ascii="Calibri" w:hAnsi="Calibri"/>
-                <w:sz w:val="20"/>
-              </w:rPr>
-              <w:t xml:space="preserve">CDK5</w:t>
-            </w:r>
-            <w:r>
-              <w:rPr>
-                <w:rFonts w:ascii="Calibri" w:hAnsi="Calibri"/>
-                <w:sz w:val="20"/>
-              </w:rPr>
-              <w:t xml:space="preserve">, </w:t>
-            </w:r>
-            <w:r>
-              <w:rPr>
-                <w:i/>
-                <w:rFonts w:ascii="Calibri" w:hAnsi="Calibri"/>
-                <w:sz w:val="20"/>
-              </w:rPr>
-              <w:t xml:space="preserve">LRRK2</w:t>
-            </w:r>
-            <w:r>
-              <w:rPr>
-                <w:rFonts w:ascii="Calibri" w:hAnsi="Calibri"/>
-                <w:sz w:val="20"/>
-              </w:rPr>
-              <w:t xml:space="preserve">, inborn disorder of neurotransmitter metabolism and transport, neuroinflammation</w:t>
+                <w:rFonts w:ascii="Calibri" w:hAnsi="Calibri"/>
+                <w:sz w:val="20"/>
+              </w:rPr>
+              <w:t xml:space="preserve">autism, axonal neuropathy, generalized dystonia, inborn disorder of neurotransmitter metabolism and transport, intellectual disability, movement disorder, neurodegenerative disease, spasticity</w:t>
             </w:r>
           </w:p>
         </w:tc>
@@ -682,39 +614,31 @@
                 <w:sz w:val="20"/>
                 <w:b w:val="true"/>
               </w:rPr>
-              <w:t xml:space="preserve">buspirone</w:t>
-            </w:r>
-          </w:p>
-        </w:tc>
-        <w:tc>
-          <w:tcPr>
-            <w:tcBorders>
-              <w:top w:val="single" w:space="0" w:color="D3D3D3"/>
-              <w:bottom w:val="single" w:space="0" w:color="D3D3D3"/>
-              <w:start w:val="single" w:space="0" w:color="D3D3D3"/>
-              <w:end w:val="single" w:space="0" w:color="D3D3D3"/>
-            </w:tcBorders>
-          </w:tcPr>
-          <w:p>
-            <w:pPr>
-              <w:spacing w:before="0" w:after="60"/>
-              <w:keepNext/>
-              <w:jc w:val="center"/>
-            </w:pPr>
-            <w:r>
-              <w:rPr>
-                <w:i/>
-                <w:rFonts w:ascii="Calibri" w:hAnsi="Calibri"/>
-                <w:sz w:val="20"/>
-              </w:rPr>
-              <w:t xml:space="preserve">DRD1</w:t>
-            </w:r>
-            <w:r>
-              <w:rPr>
-                <w:rFonts w:ascii="Calibri" w:hAnsi="Calibri"/>
-                <w:sz w:val="20"/>
-              </w:rPr>
-              <w:t xml:space="preserve">, autism, axonal neuropathy, cerebellar ataxia, generalized dystonia, inborn disorder of neurotransmitter metabolism and transport, intellectual disability, movement disorder, neurodegenerative disease, neurodevelopmental disorder, spasticity</w:t>
+              <w:t xml:space="preserve">cyproheptadine</w:t>
+            </w:r>
+          </w:p>
+        </w:tc>
+        <w:tc>
+          <w:tcPr>
+            <w:tcBorders>
+              <w:top w:val="single" w:space="0" w:color="D3D3D3"/>
+              <w:bottom w:val="single" w:space="0" w:color="D3D3D3"/>
+              <w:start w:val="single" w:space="0" w:color="D3D3D3"/>
+              <w:end w:val="single" w:space="0" w:color="D3D3D3"/>
+            </w:tcBorders>
+          </w:tcPr>
+          <w:p>
+            <w:pPr>
+              <w:spacing w:before="0" w:after="60"/>
+              <w:keepNext/>
+              <w:jc w:val="center"/>
+            </w:pPr>
+            <w:r>
+              <w:rPr>
+                <w:rFonts w:ascii="Calibri" w:hAnsi="Calibri"/>
+                <w:sz w:val="20"/>
+              </w:rPr>
+              <w:t xml:space="preserve">cerebral atrophy, generalized dystonia, inborn disorder of neurotransmitter metabolism and transport, neurodevelopmental disorder</w:t>
             </w:r>
           </w:p>
         </w:tc>
@@ -745,7 +669,7 @@
                 <w:sz w:val="20"/>
                 <w:b w:val="true"/>
               </w:rPr>
-              <w:t xml:space="preserve">calcium chloride</w:t>
+              <w:t xml:space="preserve">desvenlafaxine</w:t>
             </w:r>
           </w:p>
         </w:tc>
@@ -770,7 +694,7 @@
                 <w:rFonts w:ascii="Calibri" w:hAnsi="Calibri"/>
                 <w:sz w:val="20"/>
               </w:rPr>
-              <w:t xml:space="preserve">axonal neuropathy</w:t>
+              <w:t xml:space="preserve">autism, axonal neuropathy</w:t>
             </w:r>
           </w:p>
         </w:tc>
@@ -801,31 +725,39 @@
                 <w:sz w:val="20"/>
                 <w:b w:val="true"/>
               </w:rPr>
-              <w:t xml:space="preserve">clonidine</w:t>
-            </w:r>
-          </w:p>
-        </w:tc>
-        <w:tc>
-          <w:tcPr>
-            <w:tcBorders>
-              <w:top w:val="single" w:space="0" w:color="D3D3D3"/>
-              <w:bottom w:val="single" w:space="0" w:color="D3D3D3"/>
-              <w:start w:val="single" w:space="0" w:color="D3D3D3"/>
-              <w:end w:val="single" w:space="0" w:color="D3D3D3"/>
-            </w:tcBorders>
-          </w:tcPr>
-          <w:p>
-            <w:pPr>
-              <w:spacing w:before="0" w:after="60"/>
-              <w:keepNext/>
-              <w:jc w:val="center"/>
-            </w:pPr>
-            <w:r>
-              <w:rPr>
-                <w:rFonts w:ascii="Calibri" w:hAnsi="Calibri"/>
-                <w:sz w:val="20"/>
-              </w:rPr>
-              <w:t xml:space="preserve">autism, axonal neuropathy, generalized dystonia, inborn disorder of neurotransmitter metabolism and transport, intellectual disability, movement disorder, neurodegenerative disease, spasticity</w:t>
+              <w:t xml:space="preserve">escitalopram</w:t>
+            </w:r>
+          </w:p>
+        </w:tc>
+        <w:tc>
+          <w:tcPr>
+            <w:tcBorders>
+              <w:top w:val="single" w:space="0" w:color="D3D3D3"/>
+              <w:bottom w:val="single" w:space="0" w:color="D3D3D3"/>
+              <w:start w:val="single" w:space="0" w:color="D3D3D3"/>
+              <w:end w:val="single" w:space="0" w:color="D3D3D3"/>
+            </w:tcBorders>
+          </w:tcPr>
+          <w:p>
+            <w:pPr>
+              <w:spacing w:before="0" w:after="60"/>
+              <w:keepNext/>
+              <w:jc w:val="center"/>
+            </w:pPr>
+            <w:r>
+              <w:rPr>
+                <w:i/>
+                <w:rFonts w:ascii="Calibri" w:hAnsi="Calibri"/>
+                <w:sz w:val="20"/>
+              </w:rPr>
+              <w:t xml:space="preserve">SPAG9</w:t>
+            </w:r>
+            <w:r>
+              <w:rPr>
+                <w:rFonts w:ascii="Calibri" w:hAnsi="Calibri"/>
+                <w:sz w:val="20"/>
+              </w:rPr>
+              <w:t xml:space="preserve">, autism, axonal neuropathy, cerebellar ataxia, generalized dystonia, inborn disorder of neurotransmitter metabolism and transport, movement disorder, neurodegenerative disease, neurodevelopmental disorder</w:t>
             </w:r>
           </w:p>
         </w:tc>
@@ -856,7 +788,7 @@
                 <w:sz w:val="20"/>
                 <w:b w:val="true"/>
               </w:rPr>
-              <w:t xml:space="preserve">cyproheptadine</w:t>
+              <w:t xml:space="preserve">gabapentin</w:t>
             </w:r>
           </w:p>
         </w:tc>
@@ -878,10 +810,18 @@
             </w:pPr>
             <w:r>
               <w:rPr>
-                <w:rFonts w:ascii="Calibri" w:hAnsi="Calibri"/>
-                <w:sz w:val="20"/>
-              </w:rPr>
-              <w:t xml:space="preserve">cerebral atrophy, generalized dystonia, inborn disorder of neurotransmitter metabolism and transport, neurodevelopmental disorder</w:t>
+                <w:i/>
+                <w:rFonts w:ascii="Calibri" w:hAnsi="Calibri"/>
+                <w:sz w:val="20"/>
+              </w:rPr>
+              <w:t xml:space="preserve">NTRK2</w:t>
+            </w:r>
+            <w:r>
+              <w:rPr>
+                <w:rFonts w:ascii="Calibri" w:hAnsi="Calibri"/>
+                <w:sz w:val="20"/>
+              </w:rPr>
+              <w:t xml:space="preserve">, autism, axonal neuropathy, cerebellar ataxia, generalized dystonia, inborn disorder of neurotransmitter metabolism and transport, intellectual disability, movement disorder, neurodegenerative disease, neurodevelopmental disorder, spastic diplegia, spasticity</w:t>
             </w:r>
           </w:p>
         </w:tc>
@@ -912,31 +852,54 @@
                 <w:sz w:val="20"/>
                 <w:b w:val="true"/>
               </w:rPr>
-              <w:t xml:space="preserve">desvenlafaxine</w:t>
-            </w:r>
-          </w:p>
-        </w:tc>
-        <w:tc>
-          <w:tcPr>
-            <w:tcBorders>
-              <w:top w:val="single" w:space="0" w:color="D3D3D3"/>
-              <w:bottom w:val="single" w:space="0" w:color="D3D3D3"/>
-              <w:start w:val="single" w:space="0" w:color="D3D3D3"/>
-              <w:end w:val="single" w:space="0" w:color="D3D3D3"/>
-            </w:tcBorders>
-          </w:tcPr>
-          <w:p>
-            <w:pPr>
-              <w:spacing w:before="0" w:after="60"/>
-              <w:keepNext/>
-              <w:jc w:val="center"/>
-            </w:pPr>
-            <w:r>
-              <w:rPr>
-                <w:rFonts w:ascii="Calibri" w:hAnsi="Calibri"/>
-                <w:sz w:val="20"/>
-              </w:rPr>
-              <w:t xml:space="preserve">autism, axonal neuropathy</w:t>
+              <w:t xml:space="preserve">glutamic acid</w:t>
+            </w:r>
+          </w:p>
+        </w:tc>
+        <w:tc>
+          <w:tcPr>
+            <w:tcBorders>
+              <w:top w:val="single" w:space="0" w:color="D3D3D3"/>
+              <w:bottom w:val="single" w:space="0" w:color="D3D3D3"/>
+              <w:start w:val="single" w:space="0" w:color="D3D3D3"/>
+              <w:end w:val="single" w:space="0" w:color="D3D3D3"/>
+            </w:tcBorders>
+          </w:tcPr>
+          <w:p>
+            <w:pPr>
+              <w:spacing w:before="0" w:after="60"/>
+              <w:keepNext/>
+              <w:jc w:val="center"/>
+            </w:pPr>
+            <w:r>
+              <w:rPr>
+                <w:i/>
+                <w:rFonts w:ascii="Calibri" w:hAnsi="Calibri"/>
+                <w:sz w:val="20"/>
+              </w:rPr>
+              <w:t xml:space="preserve">LRRK2</w:t>
+            </w:r>
+            <w:r>
+              <w:rPr>
+                <w:rFonts w:ascii="Calibri" w:hAnsi="Calibri"/>
+                <w:sz w:val="20"/>
+              </w:rPr>
+              <w:t xml:space="preserve">, </w:t>
+            </w:r>
+            <w:r>
+              <w:rPr>
+                <w:i/>
+                <w:rFonts w:ascii="Calibri" w:hAnsi="Calibri"/>
+                <w:sz w:val="20"/>
+              </w:rPr>
+              <w:t xml:space="preserve">NTRK2</w:t>
+            </w:r>
+            <w:r>
+              <w:rPr>
+                <w:rFonts w:ascii="Calibri" w:hAnsi="Calibri"/>
+                <w:sz w:val="20"/>
+              </w:rPr>
+              <w:t xml:space="preserve">, autism, axonal neuropathy, intellectual disability, neurodevelopmental disorder</w:t>
             </w:r>
           </w:p>
         </w:tc>
@@ -967,7 +930,7 @@
                 <w:sz w:val="20"/>
                 <w:b w:val="true"/>
               </w:rPr>
-              <w:t xml:space="preserve">escitalopram</w:t>
+              <w:t xml:space="preserve">hydroxyzine</w:t>
             </w:r>
           </w:p>
         </w:tc>
@@ -989,18 +952,10 @@
             </w:pPr>
             <w:r>
               <w:rPr>
-                <w:i/>
-                <w:rFonts w:ascii="Calibri" w:hAnsi="Calibri"/>
-                <w:sz w:val="20"/>
-              </w:rPr>
-              <w:t xml:space="preserve">SPAG9</w:t>
-            </w:r>
-            <w:r>
-              <w:rPr>
-                <w:rFonts w:ascii="Calibri" w:hAnsi="Calibri"/>
-                <w:sz w:val="20"/>
-              </w:rPr>
-              <w:t xml:space="preserve">, autism, axonal neuropathy, cerebellar ataxia, generalized dystonia, inborn disorder of neurotransmitter metabolism and transport, movement disorder, neurodegenerative disease, neurodevelopmental disorder</w:t>
+                <w:rFonts w:ascii="Calibri" w:hAnsi="Calibri"/>
+                <w:sz w:val="20"/>
+              </w:rPr>
+              <w:t xml:space="preserve">axonal neuropathy, inborn disorder of neurotransmitter metabolism and transport</w:t>
             </w:r>
           </w:p>
         </w:tc>
@@ -1031,7 +986,7 @@
                 <w:sz w:val="20"/>
                 <w:b w:val="true"/>
               </w:rPr>
-              <w:t xml:space="preserve">gabapentin</w:t>
+              <w:t xml:space="preserve">metformin</w:t>
             </w:r>
           </w:p>
         </w:tc>
@@ -1056,6 +1011,51 @@
                 <w:rFonts w:ascii="Calibri" w:hAnsi="Calibri"/>
                 <w:sz w:val="20"/>
               </w:rPr>
+              <w:t xml:space="preserve">ARF6</w:t>
+            </w:r>
+            <w:r>
+              <w:rPr>
+                <w:rFonts w:ascii="Calibri" w:hAnsi="Calibri"/>
+                <w:sz w:val="20"/>
+              </w:rPr>
+              <w:t xml:space="preserve">, </w:t>
+            </w:r>
+            <w:r>
+              <w:rPr>
+                <w:i/>
+                <w:rFonts w:ascii="Calibri" w:hAnsi="Calibri"/>
+                <w:sz w:val="20"/>
+              </w:rPr>
+              <w:t xml:space="preserve">DRD2</w:t>
+            </w:r>
+            <w:r>
+              <w:rPr>
+                <w:rFonts w:ascii="Calibri" w:hAnsi="Calibri"/>
+                <w:sz w:val="20"/>
+              </w:rPr>
+              <w:t xml:space="preserve">, </w:t>
+            </w:r>
+            <w:r>
+              <w:rPr>
+                <w:i/>
+                <w:rFonts w:ascii="Calibri" w:hAnsi="Calibri"/>
+                <w:sz w:val="20"/>
+              </w:rPr>
+              <w:t xml:space="preserve">LRRK2</w:t>
+            </w:r>
+            <w:r>
+              <w:rPr>
+                <w:rFonts w:ascii="Calibri" w:hAnsi="Calibri"/>
+                <w:sz w:val="20"/>
+              </w:rPr>
+              <w:t xml:space="preserve">, </w:t>
+            </w:r>
+            <w:r>
+              <w:rPr>
+                <w:i/>
+                <w:rFonts w:ascii="Calibri" w:hAnsi="Calibri"/>
+                <w:sz w:val="20"/>
+              </w:rPr>
               <w:t xml:space="preserve">NTRK2</w:t>
             </w:r>
             <w:r>
@@ -1063,7 +1063,22 @@
                 <w:rFonts w:ascii="Calibri" w:hAnsi="Calibri"/>
                 <w:sz w:val="20"/>
               </w:rPr>
-              <w:t xml:space="preserve">, autism, axonal neuropathy, cerebellar ataxia, generalized dystonia, inborn disorder of neurotransmitter metabolism and transport, intellectual disability, movement disorder, neurodegenerative disease, neurodevelopmental disorder, spastic diplegia, spasticity</w:t>
+              <w:t xml:space="preserve">, </w:t>
+            </w:r>
+            <w:r>
+              <w:rPr>
+                <w:i/>
+                <w:rFonts w:ascii="Calibri" w:hAnsi="Calibri"/>
+                <w:sz w:val="20"/>
+              </w:rPr>
+              <w:t xml:space="preserve">SPAG9</w:t>
+            </w:r>
+            <w:r>
+              <w:rPr>
+                <w:rFonts w:ascii="Calibri" w:hAnsi="Calibri"/>
+                <w:sz w:val="20"/>
+              </w:rPr>
+              <w:t xml:space="preserve">, autism, axonal neuropathy, cerebellar ataxia, generalized dystonia, inborn disorder of neurotransmitter metabolism and transport, increased reactive oxygen species production, intellectual disability, movement disorder, neurodegenerative disease, neurodevelopmental disorder, neuroinflammation, spastic diplegia</w:t>
             </w:r>
           </w:p>
         </w:tc>
@@ -1094,7 +1109,7 @@
                 <w:sz w:val="20"/>
                 <w:b w:val="true"/>
               </w:rPr>
-              <w:t xml:space="preserve">glutamic acid</w:t>
+              <w:t xml:space="preserve">metoprolol</w:t>
             </w:r>
           </w:p>
         </w:tc>
@@ -1116,33 +1131,10 @@
             </w:pPr>
             <w:r>
               <w:rPr>
-                <w:i/>
-                <w:rFonts w:ascii="Calibri" w:hAnsi="Calibri"/>
-                <w:sz w:val="20"/>
-              </w:rPr>
-              <w:t xml:space="preserve">LRRK2</w:t>
-            </w:r>
-            <w:r>
-              <w:rPr>
-                <w:rFonts w:ascii="Calibri" w:hAnsi="Calibri"/>
-                <w:sz w:val="20"/>
-              </w:rPr>
-              <w:t xml:space="preserve">, </w:t>
-            </w:r>
-            <w:r>
-              <w:rPr>
-                <w:i/>
-                <w:rFonts w:ascii="Calibri" w:hAnsi="Calibri"/>
-                <w:sz w:val="20"/>
-              </w:rPr>
-              <w:t xml:space="preserve">NTRK2</w:t>
-            </w:r>
-            <w:r>
-              <w:rPr>
-                <w:rFonts w:ascii="Calibri" w:hAnsi="Calibri"/>
-                <w:sz w:val="20"/>
-              </w:rPr>
-              <w:t xml:space="preserve">, autism, axonal neuropathy, intellectual disability, neurodevelopmental disorder</w:t>
+                <w:rFonts w:ascii="Calibri" w:hAnsi="Calibri"/>
+                <w:sz w:val="20"/>
+              </w:rPr>
+              <w:t xml:space="preserve">autism, axonal neuropathy, inborn disorder of neurotransmitter metabolism and transport, increased reactive oxygen species production, intellectual disability, movement disorder</w:t>
             </w:r>
           </w:p>
         </w:tc>
@@ -1173,31 +1165,39 @@
                 <w:sz w:val="20"/>
                 <w:b w:val="true"/>
               </w:rPr>
-              <w:t xml:space="preserve">hydroxyzine</w:t>
-            </w:r>
-          </w:p>
-        </w:tc>
-        <w:tc>
-          <w:tcPr>
-            <w:tcBorders>
-              <w:top w:val="single" w:space="0" w:color="D3D3D3"/>
-              <w:bottom w:val="single" w:space="0" w:color="D3D3D3"/>
-              <w:start w:val="single" w:space="0" w:color="D3D3D3"/>
-              <w:end w:val="single" w:space="0" w:color="D3D3D3"/>
-            </w:tcBorders>
-          </w:tcPr>
-          <w:p>
-            <w:pPr>
-              <w:spacing w:before="0" w:after="60"/>
-              <w:keepNext/>
-              <w:jc w:val="center"/>
-            </w:pPr>
-            <w:r>
-              <w:rPr>
-                <w:rFonts w:ascii="Calibri" w:hAnsi="Calibri"/>
-                <w:sz w:val="20"/>
-              </w:rPr>
-              <w:t xml:space="preserve">axonal neuropathy, inborn disorder of neurotransmitter metabolism and transport</w:t>
+              <w:t xml:space="preserve">oseltamivir</w:t>
+            </w:r>
+          </w:p>
+        </w:tc>
+        <w:tc>
+          <w:tcPr>
+            <w:tcBorders>
+              <w:top w:val="single" w:space="0" w:color="D3D3D3"/>
+              <w:bottom w:val="single" w:space="0" w:color="D3D3D3"/>
+              <w:start w:val="single" w:space="0" w:color="D3D3D3"/>
+              <w:end w:val="single" w:space="0" w:color="D3D3D3"/>
+            </w:tcBorders>
+          </w:tcPr>
+          <w:p>
+            <w:pPr>
+              <w:spacing w:before="0" w:after="60"/>
+              <w:keepNext/>
+              <w:jc w:val="center"/>
+            </w:pPr>
+            <w:r>
+              <w:rPr>
+                <w:i/>
+                <w:rFonts w:ascii="Calibri" w:hAnsi="Calibri"/>
+                <w:sz w:val="20"/>
+              </w:rPr>
+              <w:t xml:space="preserve">NTRK2</w:t>
+            </w:r>
+            <w:r>
+              <w:rPr>
+                <w:rFonts w:ascii="Calibri" w:hAnsi="Calibri"/>
+                <w:sz w:val="20"/>
+              </w:rPr>
+              <w:t xml:space="preserve">, neuroinflammation</w:t>
             </w:r>
           </w:p>
         </w:tc>
@@ -1228,7 +1228,7 @@
                 <w:sz w:val="20"/>
                 <w:b w:val="true"/>
               </w:rPr>
-              <w:t xml:space="preserve">metformin</w:t>
+              <w:t xml:space="preserve">propranolol</w:t>
             </w:r>
           </w:p>
         </w:tc>
@@ -1269,7 +1269,7 @@
                 <w:rFonts w:ascii="Calibri" w:hAnsi="Calibri"/>
                 <w:sz w:val="20"/>
               </w:rPr>
-              <w:t xml:space="preserve">DRD2</w:t>
+              <w:t xml:space="preserve">LRRK2</w:t>
             </w:r>
             <w:r>
               <w:rPr>
@@ -1284,21 +1284,6 @@
                 <w:rFonts w:ascii="Calibri" w:hAnsi="Calibri"/>
                 <w:sz w:val="20"/>
               </w:rPr>
-              <w:t xml:space="preserve">LRRK2</w:t>
-            </w:r>
-            <w:r>
-              <w:rPr>
-                <w:rFonts w:ascii="Calibri" w:hAnsi="Calibri"/>
-                <w:sz w:val="20"/>
-              </w:rPr>
-              <w:t xml:space="preserve">, </w:t>
-            </w:r>
-            <w:r>
-              <w:rPr>
-                <w:i/>
-                <w:rFonts w:ascii="Calibri" w:hAnsi="Calibri"/>
-                <w:sz w:val="20"/>
-              </w:rPr>
               <w:t xml:space="preserve">NTRK2</w:t>
             </w:r>
             <w:r>
@@ -1306,22 +1291,7 @@
                 <w:rFonts w:ascii="Calibri" w:hAnsi="Calibri"/>
                 <w:sz w:val="20"/>
               </w:rPr>
-              <w:t xml:space="preserve">, </w:t>
-            </w:r>
-            <w:r>
-              <w:rPr>
-                <w:i/>
-                <w:rFonts w:ascii="Calibri" w:hAnsi="Calibri"/>
-                <w:sz w:val="20"/>
-              </w:rPr>
-              <w:t xml:space="preserve">SPAG9</w:t>
-            </w:r>
-            <w:r>
-              <w:rPr>
-                <w:rFonts w:ascii="Calibri" w:hAnsi="Calibri"/>
-                <w:sz w:val="20"/>
-              </w:rPr>
-              <w:t xml:space="preserve">, autism, axonal neuropathy, cerebellar ataxia, generalized dystonia, inborn disorder of neurotransmitter metabolism and transport, increased reactive oxygen species production, intellectual disability, movement disorder, neurodegenerative disease, neurodevelopmental disorder, neuroinflammation, spastic diplegia</w:t>
+              <w:t xml:space="preserve">, autism, axonal neuropathy, cerebellar ataxia, generalized dystonia, inborn disorder of neurotransmitter metabolism and transport, movement disorder, neurodegenerative disease, neurodevelopmental disorder, neuroinflammation</w:t>
             </w:r>
           </w:p>
         </w:tc>
@@ -1352,31 +1322,31 @@
                 <w:sz w:val="20"/>
                 <w:b w:val="true"/>
               </w:rPr>
-              <w:t xml:space="preserve">metoprolol</w:t>
-            </w:r>
-          </w:p>
-        </w:tc>
-        <w:tc>
-          <w:tcPr>
-            <w:tcBorders>
-              <w:top w:val="single" w:space="0" w:color="D3D3D3"/>
-              <w:bottom w:val="single" w:space="0" w:color="D3D3D3"/>
-              <w:start w:val="single" w:space="0" w:color="D3D3D3"/>
-              <w:end w:val="single" w:space="0" w:color="D3D3D3"/>
-            </w:tcBorders>
-          </w:tcPr>
-          <w:p>
-            <w:pPr>
-              <w:spacing w:before="0" w:after="60"/>
-              <w:keepNext/>
-              <w:jc w:val="center"/>
-            </w:pPr>
-            <w:r>
-              <w:rPr>
-                <w:rFonts w:ascii="Calibri" w:hAnsi="Calibri"/>
-                <w:sz w:val="20"/>
-              </w:rPr>
-              <w:t xml:space="preserve">autism, axonal neuropathy, inborn disorder of neurotransmitter metabolism and transport, increased reactive oxygen species production, intellectual disability, movement disorder</w:t>
+              <w:t xml:space="preserve">pyridoxine</w:t>
+            </w:r>
+          </w:p>
+        </w:tc>
+        <w:tc>
+          <w:tcPr>
+            <w:tcBorders>
+              <w:top w:val="single" w:space="0" w:color="D3D3D3"/>
+              <w:bottom w:val="single" w:space="0" w:color="D3D3D3"/>
+              <w:start w:val="single" w:space="0" w:color="D3D3D3"/>
+              <w:end w:val="single" w:space="0" w:color="D3D3D3"/>
+            </w:tcBorders>
+          </w:tcPr>
+          <w:p>
+            <w:pPr>
+              <w:spacing w:before="0" w:after="60"/>
+              <w:keepNext/>
+              <w:jc w:val="center"/>
+            </w:pPr>
+            <w:r>
+              <w:rPr>
+                <w:rFonts w:ascii="Calibri" w:hAnsi="Calibri"/>
+                <w:sz w:val="20"/>
+              </w:rPr>
+              <w:t xml:space="preserve">autism, cerebellar ataxia, generalized dystonia, hypotonia, inborn disorder of neurotransmitter metabolism and transport, increased reactive oxygen species production, movement disorder, neurodevelopmental disorder</w:t>
             </w:r>
           </w:p>
         </w:tc>
@@ -1407,7 +1377,7 @@
                 <w:sz w:val="20"/>
                 <w:b w:val="true"/>
               </w:rPr>
-              <w:t xml:space="preserve">oseltamivir</w:t>
+              <w:t xml:space="preserve">triamcinolone</w:t>
             </w:r>
           </w:p>
         </w:tc>
@@ -1420,218 +1390,6 @@
               <w:end w:val="single" w:space="0" w:color="D3D3D3"/>
             </w:tcBorders>
             <w:shd w:val="clear" w:color="auto" w:fill="F2F2F2"/>
-          </w:tcPr>
-          <w:p>
-            <w:pPr>
-              <w:spacing w:before="0" w:after="60"/>
-              <w:keepNext/>
-              <w:jc w:val="center"/>
-            </w:pPr>
-            <w:r>
-              <w:rPr>
-                <w:i/>
-                <w:rFonts w:ascii="Calibri" w:hAnsi="Calibri"/>
-                <w:sz w:val="20"/>
-              </w:rPr>
-              <w:t xml:space="preserve">NTRK2</w:t>
-            </w:r>
-            <w:r>
-              <w:rPr>
-                <w:rFonts w:ascii="Calibri" w:hAnsi="Calibri"/>
-                <w:sz w:val="20"/>
-              </w:rPr>
-              <w:t xml:space="preserve">, neuroinflammation</w:t>
-            </w:r>
-          </w:p>
-        </w:tc>
-      </w:tr>
-      <w:tr>
-        <w:trPr>
-          <w:cantSplit/>
-        </w:trPr>
-        <w:tc>
-          <w:tcPr>
-            <w:tcBorders>
-              <w:top w:val="single" w:space="0" w:color="D3D3D3"/>
-              <w:bottom w:val="single" w:space="0" w:color="D3D3D3"/>
-              <w:start w:val="single" w:space="0" w:color="D3D3D3"/>
-              <w:end w:val="single" w:space="0" w:color="D3D3D3"/>
-            </w:tcBorders>
-            <w:shd w:val="clear" w:color="auto" w:fill="E5E5E5"/>
-          </w:tcPr>
-          <w:p>
-            <w:pPr>
-              <w:spacing w:before="0" w:after="60"/>
-              <w:keepNext/>
-              <w:jc w:val="center"/>
-            </w:pPr>
-            <w:r>
-              <w:rPr>
-                <w:rFonts w:ascii="Calibri" w:hAnsi="Calibri"/>
-                <w:sz w:val="20"/>
-                <w:b w:val="true"/>
-              </w:rPr>
-              <w:t xml:space="preserve">propranolol</w:t>
-            </w:r>
-          </w:p>
-        </w:tc>
-        <w:tc>
-          <w:tcPr>
-            <w:tcBorders>
-              <w:top w:val="single" w:space="0" w:color="D3D3D3"/>
-              <w:bottom w:val="single" w:space="0" w:color="D3D3D3"/>
-              <w:start w:val="single" w:space="0" w:color="D3D3D3"/>
-              <w:end w:val="single" w:space="0" w:color="D3D3D3"/>
-            </w:tcBorders>
-          </w:tcPr>
-          <w:p>
-            <w:pPr>
-              <w:spacing w:before="0" w:after="60"/>
-              <w:keepNext/>
-              <w:jc w:val="center"/>
-            </w:pPr>
-            <w:r>
-              <w:rPr>
-                <w:i/>
-                <w:rFonts w:ascii="Calibri" w:hAnsi="Calibri"/>
-                <w:sz w:val="20"/>
-              </w:rPr>
-              <w:t xml:space="preserve">ARF6</w:t>
-            </w:r>
-            <w:r>
-              <w:rPr>
-                <w:rFonts w:ascii="Calibri" w:hAnsi="Calibri"/>
-                <w:sz w:val="20"/>
-              </w:rPr>
-              <w:t xml:space="preserve">, </w:t>
-            </w:r>
-            <w:r>
-              <w:rPr>
-                <w:i/>
-                <w:rFonts w:ascii="Calibri" w:hAnsi="Calibri"/>
-                <w:sz w:val="20"/>
-              </w:rPr>
-              <w:t xml:space="preserve">LRRK2</w:t>
-            </w:r>
-            <w:r>
-              <w:rPr>
-                <w:rFonts w:ascii="Calibri" w:hAnsi="Calibri"/>
-                <w:sz w:val="20"/>
-              </w:rPr>
-              <w:t xml:space="preserve">, </w:t>
-            </w:r>
-            <w:r>
-              <w:rPr>
-                <w:i/>
-                <w:rFonts w:ascii="Calibri" w:hAnsi="Calibri"/>
-                <w:sz w:val="20"/>
-              </w:rPr>
-              <w:t xml:space="preserve">NTRK2</w:t>
-            </w:r>
-            <w:r>
-              <w:rPr>
-                <w:rFonts w:ascii="Calibri" w:hAnsi="Calibri"/>
-                <w:sz w:val="20"/>
-              </w:rPr>
-              <w:t xml:space="preserve">, autism, axonal neuropathy, cerebellar ataxia, generalized dystonia, inborn disorder of neurotransmitter metabolism and transport, movement disorder, neurodegenerative disease, neurodevelopmental disorder, neuroinflammation</w:t>
-            </w:r>
-          </w:p>
-        </w:tc>
-      </w:tr>
-      <w:tr>
-        <w:trPr>
-          <w:cantSplit/>
-        </w:trPr>
-        <w:tc>
-          <w:tcPr>
-            <w:tcBorders>
-              <w:top w:val="single" w:space="0" w:color="D3D3D3"/>
-              <w:bottom w:val="single" w:space="0" w:color="D3D3D3"/>
-              <w:start w:val="single" w:space="0" w:color="D3D3D3"/>
-              <w:end w:val="single" w:space="0" w:color="D3D3D3"/>
-            </w:tcBorders>
-            <w:shd w:val="clear" w:color="auto" w:fill="E5E5E5"/>
-          </w:tcPr>
-          <w:p>
-            <w:pPr>
-              <w:spacing w:before="0" w:after="60"/>
-              <w:keepNext/>
-              <w:jc w:val="center"/>
-            </w:pPr>
-            <w:r>
-              <w:rPr>
-                <w:rFonts w:ascii="Calibri" w:hAnsi="Calibri"/>
-                <w:sz w:val="20"/>
-                <w:b w:val="true"/>
-              </w:rPr>
-              <w:t xml:space="preserve">pyridoxine</w:t>
-            </w:r>
-          </w:p>
-        </w:tc>
-        <w:tc>
-          <w:tcPr>
-            <w:tcBorders>
-              <w:top w:val="single" w:space="0" w:color="D3D3D3"/>
-              <w:bottom w:val="single" w:space="0" w:color="D3D3D3"/>
-              <w:start w:val="single" w:space="0" w:color="D3D3D3"/>
-              <w:end w:val="single" w:space="0" w:color="D3D3D3"/>
-            </w:tcBorders>
-            <w:shd w:val="clear" w:color="auto" w:fill="F2F2F2"/>
-          </w:tcPr>
-          <w:p>
-            <w:pPr>
-              <w:spacing w:before="0" w:after="60"/>
-              <w:keepNext/>
-              <w:jc w:val="center"/>
-            </w:pPr>
-            <w:r>
-              <w:rPr>
-                <w:rFonts w:ascii="Calibri" w:hAnsi="Calibri"/>
-                <w:sz w:val="20"/>
-              </w:rPr>
-              <w:t xml:space="preserve">autism, cerebellar ataxia, generalized dystonia, hypotonia, inborn disorder of neurotransmitter metabolism and transport, increased reactive oxygen species production, movement disorder, neurodevelopmental disorder</w:t>
-            </w:r>
-          </w:p>
-        </w:tc>
-      </w:tr>
-      <w:tr>
-        <w:trPr>
-          <w:cantSplit/>
-        </w:trPr>
-        <w:tc>
-          <w:tcPr>
-            <w:tcBorders>
-              <w:top w:val="single" w:space="0" w:color="D3D3D3"/>
-              <w:bottom w:val="single" w:space="0" w:color="D3D3D3"/>
-              <w:start w:val="single" w:space="0" w:color="D3D3D3"/>
-              <w:end w:val="single" w:space="0" w:color="D3D3D3"/>
-            </w:tcBorders>
-            <w:shd w:val="clear" w:color="auto" w:fill="E5E5E5"/>
-          </w:tcPr>
-          <w:p>
-            <w:pPr>
-              <w:spacing w:before="0" w:after="60"/>
-              <w:keepNext/>
-              <w:jc w:val="center"/>
-            </w:pPr>
-            <w:r>
-              <w:rPr>
-                <w:rFonts w:ascii="Calibri" w:hAnsi="Calibri"/>
-                <w:sz w:val="20"/>
-                <w:b w:val="true"/>
-              </w:rPr>
-              <w:t xml:space="preserve">triamcinolone</w:t>
-            </w:r>
-          </w:p>
-        </w:tc>
-        <w:tc>
-          <w:tcPr>
-            <w:tcBorders>
-              <w:top w:val="single" w:space="0" w:color="D3D3D3"/>
-              <w:bottom w:val="single" w:space="0" w:color="D3D3D3"/>
-              <w:start w:val="single" w:space="0" w:color="D3D3D3"/>
-              <w:end w:val="single" w:space="0" w:color="D3D3D3"/>
-            </w:tcBorders>
           </w:tcPr>
           <w:p>
             <w:pPr>

</xml_diff>